<commit_message>
rapor güncellendi ve tamamlandı
</commit_message>
<xml_diff>
--- a/RAPOR.docx
+++ b/RAPOR.docx
@@ -413,18 +413,13 @@
         <w:t>Yedeklerin doğruluğunun test edilmesi.</w:t>
       </w:r>
     </w:p>
-    <w:p>
-      <w:r>
-        <w:br w:type="page"/>
-      </w:r>
-    </w:p>
+    <w:p/>
     <w:p>
       <w:pPr>
         <w:pStyle w:val="Titre1"/>
         <w:spacing w:after="240"/>
       </w:pPr>
       <w:r>
-        <w:lastRenderedPageBreak/>
         <w:t xml:space="preserve">Gerçekleştirim ve </w:t>
       </w:r>
       <w:r>
@@ -511,6 +506,7 @@
           <w:b/>
           <w:bCs/>
         </w:rPr>
+        <w:lastRenderedPageBreak/>
         <w:t>Farklı/Diferansiyel</w:t>
       </w:r>
       <w:r>
@@ -606,11 +602,7 @@
         <w:ind w:left="360"/>
       </w:pPr>
       <w:r>
-        <w:t xml:space="preserve">Belirlenen stratejinin PostgreSQL veri tabanında ve macOS işletim sisteminde gerçekleştirilmesi için ilk olarak pgBackRest kurulumu yapılmıştır. Sonrasında yedeklerin saklanacağı repo hazırlanmış ve config </w:t>
-      </w:r>
-      <w:r>
-        <w:lastRenderedPageBreak/>
-        <w:t>dosyalarında işlem günlüğü yedeklemesini aktifleştirmek için gerekli düzenlemeler yapılmıştır.</w:t>
+        <w:t>Belirlenen stratejinin PostgreSQL veri tabanında ve macOS işletim sisteminde gerçekleştirilmesi için ilk olarak pgBackRest kurulumu yapılmıştır. Sonrasında yedeklerin saklanacağı repo hazırlanmış ve config dosyalarında işlem günlüğü yedeklemesini aktifleştirmek için gerekli düzenlemeler yapılmıştır.</w:t>
       </w:r>
     </w:p>
     <w:p>
@@ -1035,6 +1027,7 @@
         <w:rPr>
           <w:lang w:val="tr-TR"/>
         </w:rPr>
+        <w:lastRenderedPageBreak/>
         <w:t>3.3 Felaketten Kurtarma Senaryoları</w:t>
       </w:r>
     </w:p>
@@ -1118,16 +1111,49 @@
       <w:pPr>
         <w:spacing w:before="240"/>
         <w:rPr>
-          <w:lang w:val="en-US"/>
-        </w:rPr>
-      </w:pPr>
-      <w:r>
-        <w:rPr>
-          <w:lang w:val="en-US"/>
-        </w:rPr>
-        <w:lastRenderedPageBreak/>
+          <w:lang w:val="tr-TR"/>
+        </w:rPr>
+      </w:pPr>
+      <w:r>
+        <w:rPr>
+          <w:lang w:val="en-US"/>
+        </w:rPr>
+        <w:t xml:space="preserve">Bu </w:t>
+      </w:r>
+      <w:proofErr w:type="spellStart"/>
+      <w:r>
+        <w:rPr>
+          <w:lang w:val="en-US"/>
+        </w:rPr>
+        <w:t>yedek</w:t>
+      </w:r>
+      <w:proofErr w:type="spellEnd"/>
+      <w:r>
+        <w:rPr>
+          <w:lang w:val="en-US"/>
+        </w:rPr>
+        <w:t xml:space="preserve"> alma </w:t>
+      </w:r>
+      <w:r>
+        <w:rPr>
+          <w:lang w:val="tr-TR"/>
+        </w:rPr>
+        <w:t>işleminden sonra aşağıdaki komutlar kullanılarak veri tabanından veri silinmiştir. Veri silme işleminden önce tarih damgası not edilmiştir.</w:t>
+      </w:r>
+    </w:p>
+    <w:p>
+      <w:pPr>
+        <w:spacing w:before="240"/>
+        <w:rPr>
+          <w:lang w:val="en-US"/>
+        </w:rPr>
+      </w:pPr>
+      <w:r>
+        <w:rPr>
+          <w:lang w:val="en-US"/>
+        </w:rPr>
         <w:drawing>
-          <wp:inline distT="0" distB="0" distL="0" distR="0" wp14:anchorId="53AF69DE" wp14:editId="15193056">
+          <wp:inline distT="0" distB="0" distL="0" distR="0" wp14:anchorId="53AF69DE" wp14:editId="260DF7CF">
             <wp:extent cx="5971540" cy="3272790"/>
             <wp:effectExtent l="0" t="0" r="0" b="3810"/>
             <wp:docPr id="133909371" name="Image 1" descr="Une image contenant texte, capture d’écran, Police&#10;&#10;Le contenu généré par l’IA peut être incorrect."/>
@@ -1167,13 +1193,118 @@
       <w:pPr>
         <w:spacing w:before="240"/>
         <w:rPr>
-          <w:lang w:val="en-US"/>
-        </w:rPr>
-      </w:pPr>
-      <w:r>
-        <w:rPr>
-          <w:lang w:val="en-US"/>
-        </w:rPr>
+          <w:lang w:val="tr-TR"/>
+        </w:rPr>
+      </w:pPr>
+      <w:r>
+        <w:rPr>
+          <w:lang w:val="en-US"/>
+        </w:rPr>
+        <w:t xml:space="preserve">Veri </w:t>
+      </w:r>
+      <w:proofErr w:type="spellStart"/>
+      <w:r>
+        <w:rPr>
+          <w:lang w:val="en-US"/>
+        </w:rPr>
+        <w:t>silme</w:t>
+      </w:r>
+      <w:proofErr w:type="spellEnd"/>
+      <w:r>
+        <w:rPr>
+          <w:lang w:val="en-US"/>
+        </w:rPr>
+        <w:t xml:space="preserve"> </w:t>
+      </w:r>
+      <w:proofErr w:type="spellStart"/>
+      <w:r>
+        <w:rPr>
+          <w:lang w:val="en-US"/>
+        </w:rPr>
+        <w:t>işleminden</w:t>
+      </w:r>
+      <w:proofErr w:type="spellEnd"/>
+      <w:r>
+        <w:rPr>
+          <w:lang w:val="en-US"/>
+        </w:rPr>
+        <w:t xml:space="preserve"> </w:t>
+      </w:r>
+      <w:proofErr w:type="spellStart"/>
+      <w:r>
+        <w:rPr>
+          <w:lang w:val="en-US"/>
+        </w:rPr>
+        <w:t>sonra</w:t>
+      </w:r>
+      <w:proofErr w:type="spellEnd"/>
+      <w:r>
+        <w:rPr>
+          <w:lang w:val="en-US"/>
+        </w:rPr>
+        <w:t xml:space="preserve"> PostgreSQL </w:t>
+      </w:r>
+      <w:proofErr w:type="spellStart"/>
+      <w:r>
+        <w:rPr>
+          <w:lang w:val="en-US"/>
+        </w:rPr>
+        <w:t>servisi</w:t>
+      </w:r>
+      <w:proofErr w:type="spellEnd"/>
+      <w:r>
+        <w:rPr>
+          <w:lang w:val="en-US"/>
+        </w:rPr>
+        <w:t xml:space="preserve"> </w:t>
+      </w:r>
+      <w:proofErr w:type="spellStart"/>
+      <w:r>
+        <w:rPr>
+          <w:lang w:val="en-US"/>
+        </w:rPr>
+        <w:t>durdu</w:t>
+      </w:r>
+      <w:r>
+        <w:rPr>
+          <w:lang w:val="tr-TR"/>
+        </w:rPr>
+        <w:t>rulmuş</w:t>
+      </w:r>
+      <w:proofErr w:type="spellEnd"/>
+      <w:r>
+        <w:rPr>
+          <w:lang w:val="tr-TR"/>
+        </w:rPr>
+        <w:t xml:space="preserve"> ve not edilen tarih damgası ile </w:t>
+      </w:r>
+      <w:proofErr w:type="spellStart"/>
+      <w:r>
+        <w:rPr>
+          <w:lang w:val="tr-TR"/>
+        </w:rPr>
+        <w:t>pgBackRest</w:t>
+      </w:r>
+      <w:proofErr w:type="spellEnd"/>
+      <w:r>
+        <w:rPr>
+          <w:lang w:val="tr-TR"/>
+        </w:rPr>
+        <w:t xml:space="preserve"> komutu çağırılmıştır.</w:t>
+      </w:r>
+    </w:p>
+    <w:p>
+      <w:pPr>
+        <w:spacing w:before="240"/>
+        <w:rPr>
+          <w:lang w:val="en-US"/>
+        </w:rPr>
+      </w:pPr>
+      <w:r>
+        <w:rPr>
+          <w:lang w:val="en-US"/>
+        </w:rPr>
+        <w:lastRenderedPageBreak/>
         <w:drawing>
           <wp:inline distT="0" distB="0" distL="0" distR="0" wp14:anchorId="52678F47" wp14:editId="2EDAC9A7">
             <wp:extent cx="5971540" cy="1348740"/>
@@ -1222,11 +1353,630 @@
         <w:rPr>
           <w:lang w:val="en-US"/>
         </w:rPr>
-        <w:lastRenderedPageBreak/>
+        <w:t xml:space="preserve">Bu </w:t>
+      </w:r>
+      <w:proofErr w:type="spellStart"/>
+      <w:r>
+        <w:rPr>
+          <w:lang w:val="en-US"/>
+        </w:rPr>
+        <w:t>komutun</w:t>
+      </w:r>
+      <w:proofErr w:type="spellEnd"/>
+      <w:r>
+        <w:rPr>
+          <w:lang w:val="en-US"/>
+        </w:rPr>
+        <w:t xml:space="preserve"> </w:t>
+      </w:r>
+      <w:proofErr w:type="spellStart"/>
+      <w:r>
+        <w:rPr>
+          <w:lang w:val="en-US"/>
+        </w:rPr>
+        <w:t>çıktısı</w:t>
+      </w:r>
+      <w:proofErr w:type="spellEnd"/>
+      <w:r>
+        <w:rPr>
+          <w:lang w:val="en-US"/>
+        </w:rPr>
+        <w:t xml:space="preserve"> </w:t>
+      </w:r>
+      <w:proofErr w:type="spellStart"/>
+      <w:r>
+        <w:rPr>
+          <w:lang w:val="en-US"/>
+        </w:rPr>
+        <w:t>veri</w:t>
+      </w:r>
+      <w:proofErr w:type="spellEnd"/>
+      <w:r>
+        <w:rPr>
+          <w:lang w:val="en-US"/>
+        </w:rPr>
+        <w:t xml:space="preserve"> </w:t>
+      </w:r>
+      <w:proofErr w:type="spellStart"/>
+      <w:r>
+        <w:rPr>
+          <w:lang w:val="en-US"/>
+        </w:rPr>
+        <w:t>kurtarma</w:t>
+      </w:r>
+      <w:proofErr w:type="spellEnd"/>
+      <w:r>
+        <w:rPr>
+          <w:lang w:val="en-US"/>
+        </w:rPr>
+        <w:t xml:space="preserve"> </w:t>
+      </w:r>
+      <w:proofErr w:type="spellStart"/>
+      <w:r>
+        <w:rPr>
+          <w:lang w:val="en-US"/>
+        </w:rPr>
+        <w:t>işleminin</w:t>
+      </w:r>
+      <w:proofErr w:type="spellEnd"/>
+      <w:r>
+        <w:rPr>
+          <w:lang w:val="en-US"/>
+        </w:rPr>
+        <w:t xml:space="preserve"> </w:t>
+      </w:r>
+      <w:proofErr w:type="spellStart"/>
+      <w:r>
+        <w:rPr>
+          <w:lang w:val="en-US"/>
+        </w:rPr>
+        <w:t>başarılı</w:t>
+      </w:r>
+      <w:proofErr w:type="spellEnd"/>
+      <w:r>
+        <w:rPr>
+          <w:lang w:val="en-US"/>
+        </w:rPr>
+        <w:t xml:space="preserve"> </w:t>
+      </w:r>
+      <w:proofErr w:type="spellStart"/>
+      <w:r>
+        <w:rPr>
+          <w:lang w:val="en-US"/>
+        </w:rPr>
+        <w:t>şekilde</w:t>
+      </w:r>
+      <w:proofErr w:type="spellEnd"/>
+      <w:r>
+        <w:rPr>
+          <w:lang w:val="en-US"/>
+        </w:rPr>
+        <w:t xml:space="preserve"> </w:t>
+      </w:r>
+      <w:proofErr w:type="spellStart"/>
+      <w:r>
+        <w:rPr>
+          <w:lang w:val="en-US"/>
+        </w:rPr>
+        <w:t>sonuçlandığını</w:t>
+      </w:r>
+      <w:proofErr w:type="spellEnd"/>
+      <w:r>
+        <w:rPr>
+          <w:lang w:val="en-US"/>
+        </w:rPr>
+        <w:t xml:space="preserve"> </w:t>
+      </w:r>
+      <w:proofErr w:type="spellStart"/>
+      <w:r>
+        <w:rPr>
+          <w:lang w:val="en-US"/>
+        </w:rPr>
+        <w:t>göstermektedir</w:t>
+      </w:r>
+      <w:proofErr w:type="spellEnd"/>
+      <w:r>
+        <w:rPr>
+          <w:lang w:val="en-US"/>
+        </w:rPr>
+        <w:t xml:space="preserve">. </w:t>
+      </w:r>
+    </w:p>
+    <w:p>
+      <w:pPr>
+        <w:pStyle w:val="Titre2"/>
+        <w:spacing w:before="240"/>
+        <w:rPr>
+          <w:lang w:val="en-US"/>
+        </w:rPr>
+      </w:pPr>
+      <w:r>
+        <w:rPr>
+          <w:lang w:val="en-US"/>
+        </w:rPr>
+        <w:t xml:space="preserve"> </w:t>
+      </w:r>
+      <w:proofErr w:type="spellStart"/>
+      <w:r>
+        <w:rPr>
+          <w:lang w:val="en-US"/>
+        </w:rPr>
+        <w:t>Yedeklerin</w:t>
+      </w:r>
+      <w:proofErr w:type="spellEnd"/>
+      <w:r>
+        <w:rPr>
+          <w:lang w:val="en-US"/>
+        </w:rPr>
+        <w:t xml:space="preserve"> </w:t>
+      </w:r>
+      <w:proofErr w:type="spellStart"/>
+      <w:r>
+        <w:rPr>
+          <w:lang w:val="en-US"/>
+        </w:rPr>
+        <w:t>Doğruluğunu</w:t>
+      </w:r>
+      <w:proofErr w:type="spellEnd"/>
+      <w:r>
+        <w:rPr>
+          <w:lang w:val="en-US"/>
+        </w:rPr>
+        <w:t xml:space="preserve"> Test </w:t>
+      </w:r>
+      <w:proofErr w:type="spellStart"/>
+      <w:r>
+        <w:rPr>
+          <w:lang w:val="en-US"/>
+        </w:rPr>
+        <w:t>Etme</w:t>
+      </w:r>
+      <w:proofErr w:type="spellEnd"/>
+    </w:p>
+    <w:p>
+      <w:pPr>
+        <w:spacing w:before="240"/>
+        <w:rPr>
+          <w:lang w:val="en-US"/>
+        </w:rPr>
+      </w:pPr>
+      <w:proofErr w:type="spellStart"/>
+      <w:r>
+        <w:rPr>
+          <w:lang w:val="en-US"/>
+        </w:rPr>
+        <w:t>pgBackRest</w:t>
+      </w:r>
+      <w:proofErr w:type="spellEnd"/>
+      <w:r>
+        <w:rPr>
+          <w:lang w:val="en-US"/>
+        </w:rPr>
+        <w:t xml:space="preserve"> </w:t>
+      </w:r>
+      <w:proofErr w:type="spellStart"/>
+      <w:r>
+        <w:rPr>
+          <w:lang w:val="en-US"/>
+        </w:rPr>
+        <w:t>komutu</w:t>
+      </w:r>
+      <w:proofErr w:type="spellEnd"/>
+      <w:r>
+        <w:rPr>
+          <w:lang w:val="en-US"/>
+        </w:rPr>
+        <w:t xml:space="preserve"> </w:t>
+      </w:r>
+      <w:proofErr w:type="spellStart"/>
+      <w:r>
+        <w:rPr>
+          <w:lang w:val="en-US"/>
+        </w:rPr>
+        <w:t>veri</w:t>
+      </w:r>
+      <w:proofErr w:type="spellEnd"/>
+      <w:r>
+        <w:rPr>
+          <w:lang w:val="en-US"/>
+        </w:rPr>
+        <w:t xml:space="preserve"> </w:t>
+      </w:r>
+      <w:proofErr w:type="spellStart"/>
+      <w:r>
+        <w:rPr>
+          <w:lang w:val="en-US"/>
+        </w:rPr>
+        <w:t>kurtarma</w:t>
+      </w:r>
+      <w:proofErr w:type="spellEnd"/>
+      <w:r>
+        <w:rPr>
+          <w:lang w:val="en-US"/>
+        </w:rPr>
+        <w:t xml:space="preserve"> </w:t>
+      </w:r>
+      <w:proofErr w:type="spellStart"/>
+      <w:r>
+        <w:rPr>
+          <w:lang w:val="en-US"/>
+        </w:rPr>
+        <w:t>işleminin</w:t>
+      </w:r>
+      <w:proofErr w:type="spellEnd"/>
+      <w:r>
+        <w:rPr>
+          <w:lang w:val="en-US"/>
+        </w:rPr>
+        <w:t xml:space="preserve"> </w:t>
+      </w:r>
+      <w:proofErr w:type="spellStart"/>
+      <w:r>
+        <w:rPr>
+          <w:lang w:val="en-US"/>
+        </w:rPr>
+        <w:t>başarılı</w:t>
+      </w:r>
+      <w:proofErr w:type="spellEnd"/>
+      <w:r>
+        <w:rPr>
+          <w:lang w:val="en-US"/>
+        </w:rPr>
+        <w:t xml:space="preserve"> </w:t>
+      </w:r>
+      <w:proofErr w:type="spellStart"/>
+      <w:r>
+        <w:rPr>
+          <w:lang w:val="en-US"/>
+        </w:rPr>
+        <w:t>olduğunu</w:t>
+      </w:r>
+      <w:proofErr w:type="spellEnd"/>
+      <w:r>
+        <w:rPr>
+          <w:lang w:val="en-US"/>
+        </w:rPr>
+        <w:t xml:space="preserve"> </w:t>
+      </w:r>
+      <w:proofErr w:type="spellStart"/>
+      <w:r>
+        <w:rPr>
+          <w:lang w:val="en-US"/>
+        </w:rPr>
+        <w:t>söylese</w:t>
+      </w:r>
+      <w:proofErr w:type="spellEnd"/>
+      <w:r>
+        <w:rPr>
+          <w:lang w:val="en-US"/>
+        </w:rPr>
+        <w:t xml:space="preserve"> </w:t>
+      </w:r>
+      <w:proofErr w:type="spellStart"/>
+      <w:r>
+        <w:rPr>
+          <w:lang w:val="en-US"/>
+        </w:rPr>
+        <w:t>dahi</w:t>
+      </w:r>
+      <w:proofErr w:type="spellEnd"/>
+      <w:r>
+        <w:rPr>
+          <w:lang w:val="en-US"/>
+        </w:rPr>
+        <w:t xml:space="preserve"> </w:t>
+      </w:r>
+      <w:proofErr w:type="spellStart"/>
+      <w:r>
+        <w:rPr>
+          <w:lang w:val="en-US"/>
+        </w:rPr>
+        <w:t>veriler</w:t>
+      </w:r>
+      <w:proofErr w:type="spellEnd"/>
+      <w:r>
+        <w:rPr>
+          <w:lang w:val="en-US"/>
+        </w:rPr>
+        <w:t xml:space="preserve"> </w:t>
+      </w:r>
+      <w:proofErr w:type="spellStart"/>
+      <w:r>
+        <w:rPr>
+          <w:lang w:val="en-US"/>
+        </w:rPr>
+        <w:t>manuel</w:t>
+      </w:r>
+      <w:proofErr w:type="spellEnd"/>
+      <w:r>
+        <w:rPr>
+          <w:lang w:val="en-US"/>
+        </w:rPr>
+        <w:t xml:space="preserve"> </w:t>
+      </w:r>
+      <w:proofErr w:type="spellStart"/>
+      <w:r>
+        <w:rPr>
+          <w:lang w:val="en-US"/>
+        </w:rPr>
+        <w:t>olarak</w:t>
+      </w:r>
+      <w:proofErr w:type="spellEnd"/>
+      <w:r>
+        <w:rPr>
+          <w:lang w:val="en-US"/>
+        </w:rPr>
+        <w:t xml:space="preserve"> control </w:t>
+      </w:r>
+      <w:proofErr w:type="spellStart"/>
+      <w:r>
+        <w:rPr>
+          <w:lang w:val="en-US"/>
+        </w:rPr>
+        <w:t>edilmiştir</w:t>
+      </w:r>
+      <w:proofErr w:type="spellEnd"/>
+      <w:r>
+        <w:rPr>
+          <w:lang w:val="en-US"/>
+        </w:rPr>
+        <w:t xml:space="preserve">. </w:t>
+      </w:r>
+      <w:proofErr w:type="spellStart"/>
+      <w:r>
+        <w:rPr>
+          <w:lang w:val="en-US"/>
+        </w:rPr>
+        <w:t>Aşağıdaki</w:t>
+      </w:r>
+      <w:proofErr w:type="spellEnd"/>
+      <w:r>
+        <w:rPr>
+          <w:lang w:val="en-US"/>
+        </w:rPr>
+        <w:t xml:space="preserve"> </w:t>
+      </w:r>
+      <w:proofErr w:type="spellStart"/>
+      <w:r>
+        <w:rPr>
+          <w:lang w:val="en-US"/>
+        </w:rPr>
+        <w:t>komutlar</w:t>
+      </w:r>
+      <w:proofErr w:type="spellEnd"/>
+      <w:r>
+        <w:rPr>
+          <w:lang w:val="en-US"/>
+        </w:rPr>
+        <w:t xml:space="preserve"> </w:t>
+      </w:r>
+      <w:proofErr w:type="spellStart"/>
+      <w:r>
+        <w:rPr>
+          <w:lang w:val="en-US"/>
+        </w:rPr>
+        <w:t>aracılığıyla</w:t>
+      </w:r>
+      <w:proofErr w:type="spellEnd"/>
+      <w:r>
+        <w:rPr>
+          <w:lang w:val="en-US"/>
+        </w:rPr>
+        <w:t xml:space="preserve"> </w:t>
+      </w:r>
+      <w:proofErr w:type="spellStart"/>
+      <w:r>
+        <w:rPr>
+          <w:lang w:val="en-US"/>
+        </w:rPr>
+        <w:t>veri</w:t>
+      </w:r>
+      <w:proofErr w:type="spellEnd"/>
+      <w:r>
+        <w:rPr>
+          <w:lang w:val="en-US"/>
+        </w:rPr>
+        <w:t xml:space="preserve"> </w:t>
+      </w:r>
+      <w:proofErr w:type="spellStart"/>
+      <w:r>
+        <w:rPr>
+          <w:lang w:val="en-US"/>
+        </w:rPr>
+        <w:t>tabanına</w:t>
+      </w:r>
+      <w:proofErr w:type="spellEnd"/>
+      <w:r>
+        <w:rPr>
+          <w:lang w:val="en-US"/>
+        </w:rPr>
+        <w:t xml:space="preserve"> </w:t>
+      </w:r>
+      <w:proofErr w:type="spellStart"/>
+      <w:r>
+        <w:rPr>
+          <w:lang w:val="en-US"/>
+        </w:rPr>
+        <w:t>bağlanılmış</w:t>
+      </w:r>
+      <w:proofErr w:type="spellEnd"/>
+      <w:r>
+        <w:rPr>
+          <w:lang w:val="en-US"/>
+        </w:rPr>
+        <w:t xml:space="preserve"> </w:t>
+      </w:r>
+      <w:proofErr w:type="spellStart"/>
+      <w:r>
+        <w:rPr>
+          <w:lang w:val="en-US"/>
+        </w:rPr>
+        <w:t>ve</w:t>
+      </w:r>
+      <w:proofErr w:type="spellEnd"/>
+      <w:r>
+        <w:rPr>
+          <w:lang w:val="en-US"/>
+        </w:rPr>
+        <w:t xml:space="preserve"> </w:t>
+      </w:r>
+      <w:proofErr w:type="spellStart"/>
+      <w:r>
+        <w:rPr>
+          <w:lang w:val="en-US"/>
+        </w:rPr>
+        <w:t>silinen</w:t>
+      </w:r>
+      <w:proofErr w:type="spellEnd"/>
+      <w:r>
+        <w:rPr>
+          <w:lang w:val="en-US"/>
+        </w:rPr>
+        <w:t xml:space="preserve"> </w:t>
+      </w:r>
+      <w:proofErr w:type="spellStart"/>
+      <w:r>
+        <w:rPr>
+          <w:lang w:val="en-US"/>
+        </w:rPr>
+        <w:t>veri</w:t>
+      </w:r>
+      <w:proofErr w:type="spellEnd"/>
+      <w:r>
+        <w:rPr>
+          <w:lang w:val="en-US"/>
+        </w:rPr>
+        <w:t xml:space="preserve"> </w:t>
+      </w:r>
+      <w:proofErr w:type="spellStart"/>
+      <w:r>
+        <w:rPr>
+          <w:lang w:val="en-US"/>
+        </w:rPr>
+        <w:t>sorgulanmıştır</w:t>
+      </w:r>
+      <w:proofErr w:type="spellEnd"/>
+      <w:r>
+        <w:rPr>
+          <w:lang w:val="en-US"/>
+        </w:rPr>
+        <w:t xml:space="preserve">. </w:t>
+      </w:r>
+      <w:proofErr w:type="spellStart"/>
+      <w:r>
+        <w:rPr>
+          <w:lang w:val="en-US"/>
+        </w:rPr>
+        <w:t>Görüleceği</w:t>
+      </w:r>
+      <w:proofErr w:type="spellEnd"/>
+      <w:r>
+        <w:rPr>
+          <w:lang w:val="en-US"/>
+        </w:rPr>
+        <w:t xml:space="preserve"> </w:t>
+      </w:r>
+      <w:proofErr w:type="spellStart"/>
+      <w:r>
+        <w:rPr>
+          <w:lang w:val="en-US"/>
+        </w:rPr>
+        <w:t>üzere</w:t>
+      </w:r>
+      <w:proofErr w:type="spellEnd"/>
+      <w:r>
+        <w:rPr>
+          <w:lang w:val="en-US"/>
+        </w:rPr>
+        <w:t xml:space="preserve"> </w:t>
+      </w:r>
+      <w:proofErr w:type="spellStart"/>
+      <w:r>
+        <w:rPr>
+          <w:lang w:val="en-US"/>
+        </w:rPr>
+        <w:t>veri</w:t>
+      </w:r>
+      <w:proofErr w:type="spellEnd"/>
+      <w:r>
+        <w:rPr>
+          <w:lang w:val="en-US"/>
+        </w:rPr>
+        <w:t xml:space="preserve"> </w:t>
+      </w:r>
+      <w:proofErr w:type="spellStart"/>
+      <w:r>
+        <w:rPr>
+          <w:lang w:val="en-US"/>
+        </w:rPr>
+        <w:t>kurtarma</w:t>
+      </w:r>
+      <w:proofErr w:type="spellEnd"/>
+      <w:r>
+        <w:rPr>
+          <w:lang w:val="en-US"/>
+        </w:rPr>
+        <w:t xml:space="preserve"> </w:t>
+      </w:r>
+      <w:proofErr w:type="spellStart"/>
+      <w:r>
+        <w:rPr>
+          <w:lang w:val="en-US"/>
+        </w:rPr>
+        <w:t>işlemi</w:t>
+      </w:r>
+      <w:proofErr w:type="spellEnd"/>
+      <w:r>
+        <w:rPr>
+          <w:lang w:val="en-US"/>
+        </w:rPr>
+        <w:t xml:space="preserve"> </w:t>
+      </w:r>
+      <w:proofErr w:type="spellStart"/>
+      <w:r>
+        <w:rPr>
+          <w:lang w:val="en-US"/>
+        </w:rPr>
+        <w:t>başarılı</w:t>
+      </w:r>
+      <w:proofErr w:type="spellEnd"/>
+      <w:r>
+        <w:rPr>
+          <w:lang w:val="en-US"/>
+        </w:rPr>
+        <w:t xml:space="preserve"> </w:t>
+      </w:r>
+      <w:proofErr w:type="spellStart"/>
+      <w:r>
+        <w:rPr>
+          <w:lang w:val="en-US"/>
+        </w:rPr>
+        <w:t>olmuştur</w:t>
+      </w:r>
+      <w:proofErr w:type="spellEnd"/>
+      <w:r>
+        <w:rPr>
+          <w:lang w:val="en-US"/>
+        </w:rPr>
+        <w:t>.</w:t>
+      </w:r>
+    </w:p>
+    <w:p>
+      <w:pPr>
+        <w:spacing w:before="240"/>
+        <w:jc w:val="center"/>
+        <w:rPr>
+          <w:lang w:val="en-US"/>
+        </w:rPr>
+      </w:pPr>
+      <w:r>
+        <w:rPr>
+          <w:lang w:val="en-US"/>
+        </w:rPr>
         <w:drawing>
-          <wp:inline distT="0" distB="0" distL="0" distR="0" wp14:anchorId="1BE69841" wp14:editId="5C37CBEE">
-            <wp:extent cx="5971540" cy="6381750"/>
-            <wp:effectExtent l="0" t="0" r="0" b="6350"/>
+          <wp:inline distT="0" distB="0" distL="0" distR="0" wp14:anchorId="1BE69841" wp14:editId="73A7231E">
+            <wp:extent cx="3751729" cy="4009452"/>
+            <wp:effectExtent l="0" t="0" r="0" b="3810"/>
             <wp:docPr id="870245113" name="Image 1" descr="Une image contenant texte, capture d’écran&#10;&#10;Le contenu généré par l’IA peut être incorrect."/>
             <wp:cNvGraphicFramePr>
               <a:graphicFrameLocks xmlns:a="http://schemas.openxmlformats.org/drawingml/2006/main" noChangeAspect="1"/>
@@ -1247,7 +1997,7 @@
                   <pic:spPr>
                     <a:xfrm>
                       <a:off x="0" y="0"/>
-                      <a:ext cx="5971540" cy="6381750"/>
+                      <a:ext cx="3751729" cy="4009452"/>
                     </a:xfrm>
                     <a:prstGeom prst="rect">
                       <a:avLst/>
@@ -1267,11 +2017,809 @@
           <w:lang w:val="en-US"/>
         </w:rPr>
       </w:pPr>
+      <w:proofErr w:type="spellStart"/>
+      <w:r>
+        <w:rPr>
+          <w:lang w:val="en-US"/>
+        </w:rPr>
+        <w:t>Ancak</w:t>
+      </w:r>
+      <w:proofErr w:type="spellEnd"/>
+      <w:r>
+        <w:rPr>
+          <w:lang w:val="en-US"/>
+        </w:rPr>
+        <w:t xml:space="preserve"> </w:t>
+      </w:r>
+      <w:proofErr w:type="spellStart"/>
+      <w:r>
+        <w:rPr>
+          <w:lang w:val="en-US"/>
+        </w:rPr>
+        <w:t>silinen</w:t>
+      </w:r>
+      <w:proofErr w:type="spellEnd"/>
+      <w:r>
+        <w:rPr>
+          <w:lang w:val="en-US"/>
+        </w:rPr>
+        <w:t xml:space="preserve"> </w:t>
+      </w:r>
+      <w:proofErr w:type="spellStart"/>
+      <w:r>
+        <w:rPr>
+          <w:lang w:val="en-US"/>
+        </w:rPr>
+        <w:t>veriye</w:t>
+      </w:r>
+      <w:proofErr w:type="spellEnd"/>
+      <w:r>
+        <w:rPr>
+          <w:lang w:val="en-US"/>
+        </w:rPr>
+        <w:t xml:space="preserve"> </w:t>
+      </w:r>
+      <w:proofErr w:type="spellStart"/>
+      <w:r>
+        <w:rPr>
+          <w:lang w:val="en-US"/>
+        </w:rPr>
+        <w:t>ulaşabilmek</w:t>
+      </w:r>
+      <w:proofErr w:type="spellEnd"/>
+      <w:r>
+        <w:rPr>
+          <w:lang w:val="en-US"/>
+        </w:rPr>
+        <w:t xml:space="preserve"> </w:t>
+      </w:r>
+      <w:proofErr w:type="spellStart"/>
+      <w:r>
+        <w:rPr>
+          <w:lang w:val="en-US"/>
+        </w:rPr>
+        <w:t>veri</w:t>
+      </w:r>
+      <w:proofErr w:type="spellEnd"/>
+      <w:r>
+        <w:rPr>
+          <w:lang w:val="en-US"/>
+        </w:rPr>
+        <w:t xml:space="preserve"> </w:t>
+      </w:r>
+      <w:proofErr w:type="spellStart"/>
+      <w:r>
+        <w:rPr>
+          <w:lang w:val="en-US"/>
+        </w:rPr>
+        <w:t>tabanının</w:t>
+      </w:r>
+      <w:proofErr w:type="spellEnd"/>
+      <w:r>
+        <w:rPr>
+          <w:lang w:val="en-US"/>
+        </w:rPr>
+        <w:t xml:space="preserve"> </w:t>
+      </w:r>
+      <w:proofErr w:type="spellStart"/>
+      <w:r>
+        <w:rPr>
+          <w:lang w:val="en-US"/>
+        </w:rPr>
+        <w:t>düzgün</w:t>
+      </w:r>
+      <w:proofErr w:type="spellEnd"/>
+      <w:r>
+        <w:rPr>
+          <w:lang w:val="en-US"/>
+        </w:rPr>
+        <w:t xml:space="preserve"> </w:t>
+      </w:r>
+      <w:proofErr w:type="spellStart"/>
+      <w:r>
+        <w:rPr>
+          <w:lang w:val="en-US"/>
+        </w:rPr>
+        <w:t>yedeklendiği</w:t>
+      </w:r>
+      <w:proofErr w:type="spellEnd"/>
+      <w:r>
+        <w:rPr>
+          <w:lang w:val="en-US"/>
+        </w:rPr>
+        <w:t xml:space="preserve"> </w:t>
+      </w:r>
+      <w:proofErr w:type="spellStart"/>
+      <w:r>
+        <w:rPr>
+          <w:lang w:val="en-US"/>
+        </w:rPr>
+        <w:t>ve</w:t>
+      </w:r>
+      <w:proofErr w:type="spellEnd"/>
+      <w:r>
+        <w:rPr>
+          <w:lang w:val="en-US"/>
+        </w:rPr>
+        <w:t xml:space="preserve"> </w:t>
+      </w:r>
+      <w:proofErr w:type="spellStart"/>
+      <w:r>
+        <w:rPr>
+          <w:lang w:val="en-US"/>
+        </w:rPr>
+        <w:t>geri</w:t>
+      </w:r>
+      <w:proofErr w:type="spellEnd"/>
+      <w:r>
+        <w:rPr>
+          <w:lang w:val="en-US"/>
+        </w:rPr>
+        <w:t xml:space="preserve"> </w:t>
+      </w:r>
+      <w:proofErr w:type="spellStart"/>
+      <w:r>
+        <w:rPr>
+          <w:lang w:val="en-US"/>
+        </w:rPr>
+        <w:t>yüklendiği</w:t>
+      </w:r>
+      <w:proofErr w:type="spellEnd"/>
+      <w:r>
+        <w:rPr>
+          <w:lang w:val="en-US"/>
+        </w:rPr>
+        <w:t xml:space="preserve"> </w:t>
+      </w:r>
+      <w:proofErr w:type="spellStart"/>
+      <w:r>
+        <w:rPr>
+          <w:lang w:val="en-US"/>
+        </w:rPr>
+        <w:t>anlamına</w:t>
+      </w:r>
+      <w:proofErr w:type="spellEnd"/>
+      <w:r>
+        <w:rPr>
+          <w:lang w:val="en-US"/>
+        </w:rPr>
+        <w:t xml:space="preserve"> </w:t>
+      </w:r>
+      <w:proofErr w:type="spellStart"/>
+      <w:r>
+        <w:rPr>
+          <w:lang w:val="en-US"/>
+        </w:rPr>
+        <w:t>gelmemektedir</w:t>
+      </w:r>
+      <w:proofErr w:type="spellEnd"/>
+      <w:r>
+        <w:rPr>
+          <w:lang w:val="en-US"/>
+        </w:rPr>
+        <w:t xml:space="preserve">. Bunun </w:t>
+      </w:r>
+      <w:proofErr w:type="spellStart"/>
+      <w:r>
+        <w:rPr>
+          <w:lang w:val="en-US"/>
+        </w:rPr>
+        <w:t>sebebi</w:t>
+      </w:r>
+      <w:proofErr w:type="spellEnd"/>
+      <w:r>
+        <w:rPr>
+          <w:lang w:val="en-US"/>
+        </w:rPr>
+        <w:t xml:space="preserve"> </w:t>
+      </w:r>
+      <w:proofErr w:type="spellStart"/>
+      <w:r>
+        <w:rPr>
+          <w:lang w:val="en-US"/>
+        </w:rPr>
+        <w:t>yukarıdaki</w:t>
+      </w:r>
+      <w:proofErr w:type="spellEnd"/>
+      <w:r>
+        <w:rPr>
+          <w:lang w:val="en-US"/>
+        </w:rPr>
+        <w:t xml:space="preserve"> </w:t>
+      </w:r>
+      <w:proofErr w:type="spellStart"/>
+      <w:r>
+        <w:rPr>
+          <w:lang w:val="en-US"/>
+        </w:rPr>
+        <w:t>pgBackRest</w:t>
+      </w:r>
+      <w:proofErr w:type="spellEnd"/>
+      <w:r>
+        <w:rPr>
+          <w:lang w:val="en-US"/>
+        </w:rPr>
+        <w:t xml:space="preserve"> </w:t>
+      </w:r>
+      <w:proofErr w:type="spellStart"/>
+      <w:r>
+        <w:rPr>
+          <w:lang w:val="en-US"/>
+        </w:rPr>
+        <w:t>komutunun</w:t>
+      </w:r>
+      <w:proofErr w:type="spellEnd"/>
+      <w:r>
+        <w:rPr>
+          <w:lang w:val="en-US"/>
+        </w:rPr>
+        <w:t xml:space="preserve"> </w:t>
+      </w:r>
+      <w:proofErr w:type="spellStart"/>
+      <w:r>
+        <w:rPr>
+          <w:lang w:val="en-US"/>
+        </w:rPr>
+        <w:t>yedek</w:t>
+      </w:r>
+      <w:proofErr w:type="spellEnd"/>
+      <w:r>
+        <w:rPr>
+          <w:lang w:val="en-US"/>
+        </w:rPr>
+        <w:t xml:space="preserve"> </w:t>
+      </w:r>
+      <w:proofErr w:type="spellStart"/>
+      <w:r>
+        <w:rPr>
+          <w:lang w:val="en-US"/>
+        </w:rPr>
+        <w:t>geri</w:t>
+      </w:r>
+      <w:proofErr w:type="spellEnd"/>
+      <w:r>
+        <w:rPr>
+          <w:lang w:val="en-US"/>
+        </w:rPr>
+        <w:t xml:space="preserve"> </w:t>
+      </w:r>
+      <w:proofErr w:type="spellStart"/>
+      <w:r>
+        <w:rPr>
+          <w:lang w:val="en-US"/>
+        </w:rPr>
+        <w:t>yükleme</w:t>
+      </w:r>
+      <w:proofErr w:type="spellEnd"/>
+      <w:r>
+        <w:rPr>
+          <w:lang w:val="en-US"/>
+        </w:rPr>
+        <w:t xml:space="preserve"> </w:t>
+      </w:r>
+      <w:proofErr w:type="spellStart"/>
+      <w:r>
+        <w:rPr>
+          <w:lang w:val="en-US"/>
+        </w:rPr>
+        <w:t>işlemini</w:t>
+      </w:r>
+      <w:proofErr w:type="spellEnd"/>
+      <w:r>
+        <w:rPr>
+          <w:lang w:val="en-US"/>
+        </w:rPr>
+        <w:t xml:space="preserve"> </w:t>
+      </w:r>
+      <w:proofErr w:type="spellStart"/>
+      <w:r>
+        <w:rPr>
+          <w:lang w:val="en-US"/>
+        </w:rPr>
+        <w:t>bizim</w:t>
+      </w:r>
+      <w:proofErr w:type="spellEnd"/>
+      <w:r>
+        <w:rPr>
+          <w:lang w:val="en-US"/>
+        </w:rPr>
+        <w:t xml:space="preserve"> var </w:t>
+      </w:r>
+      <w:proofErr w:type="spellStart"/>
+      <w:r>
+        <w:rPr>
+          <w:lang w:val="en-US"/>
+        </w:rPr>
+        <w:t>olan</w:t>
+      </w:r>
+      <w:proofErr w:type="spellEnd"/>
+      <w:r>
+        <w:rPr>
+          <w:lang w:val="en-US"/>
+        </w:rPr>
+        <w:t xml:space="preserve"> </w:t>
+      </w:r>
+      <w:proofErr w:type="spellStart"/>
+      <w:r>
+        <w:rPr>
+          <w:lang w:val="en-US"/>
+        </w:rPr>
+        <w:t>veri</w:t>
+      </w:r>
+      <w:proofErr w:type="spellEnd"/>
+      <w:r>
+        <w:rPr>
+          <w:lang w:val="en-US"/>
+        </w:rPr>
+        <w:t xml:space="preserve"> </w:t>
+      </w:r>
+      <w:proofErr w:type="spellStart"/>
+      <w:r>
+        <w:rPr>
+          <w:lang w:val="en-US"/>
+        </w:rPr>
+        <w:t>tabanımız</w:t>
+      </w:r>
+      <w:proofErr w:type="spellEnd"/>
+      <w:r>
+        <w:rPr>
+          <w:lang w:val="en-US"/>
+        </w:rPr>
+        <w:t xml:space="preserve"> </w:t>
+      </w:r>
+      <w:proofErr w:type="spellStart"/>
+      <w:r>
+        <w:rPr>
+          <w:lang w:val="en-US"/>
+        </w:rPr>
+        <w:t>üzerine</w:t>
+      </w:r>
+      <w:proofErr w:type="spellEnd"/>
+      <w:r>
+        <w:rPr>
+          <w:lang w:val="en-US"/>
+        </w:rPr>
+        <w:t xml:space="preserve"> </w:t>
+      </w:r>
+      <w:proofErr w:type="spellStart"/>
+      <w:r>
+        <w:rPr>
+          <w:lang w:val="en-US"/>
+        </w:rPr>
+        <w:t>yapmış</w:t>
+      </w:r>
+      <w:proofErr w:type="spellEnd"/>
+      <w:r>
+        <w:rPr>
+          <w:lang w:val="en-US"/>
+        </w:rPr>
+        <w:t xml:space="preserve"> </w:t>
+      </w:r>
+      <w:proofErr w:type="spellStart"/>
+      <w:r>
+        <w:rPr>
+          <w:lang w:val="en-US"/>
+        </w:rPr>
+        <w:t>olmasıdır.</w:t>
+      </w:r>
+      <w:proofErr w:type="spellEnd"/>
+      <w:r>
+        <w:rPr>
+          <w:lang w:val="en-US"/>
+        </w:rPr>
+        <w:t xml:space="preserve"> </w:t>
+      </w:r>
+      <w:proofErr w:type="spellStart"/>
+      <w:r>
+        <w:rPr>
+          <w:lang w:val="en-US"/>
+        </w:rPr>
+        <w:t>Aşağıdaki</w:t>
+      </w:r>
+      <w:proofErr w:type="spellEnd"/>
+      <w:r>
+        <w:rPr>
+          <w:lang w:val="en-US"/>
+        </w:rPr>
+        <w:t xml:space="preserve"> </w:t>
+      </w:r>
+      <w:proofErr w:type="spellStart"/>
+      <w:r>
+        <w:rPr>
+          <w:lang w:val="en-US"/>
+        </w:rPr>
+        <w:t>komut</w:t>
+      </w:r>
+      <w:proofErr w:type="spellEnd"/>
+      <w:r>
+        <w:rPr>
+          <w:lang w:val="en-US"/>
+        </w:rPr>
+        <w:t xml:space="preserve"> </w:t>
+      </w:r>
+      <w:proofErr w:type="spellStart"/>
+      <w:r>
+        <w:rPr>
+          <w:lang w:val="en-US"/>
+        </w:rPr>
+        <w:t>aracılığıyla</w:t>
+      </w:r>
+      <w:proofErr w:type="spellEnd"/>
+      <w:r>
+        <w:rPr>
+          <w:lang w:val="en-US"/>
+        </w:rPr>
+        <w:t xml:space="preserve"> </w:t>
+      </w:r>
+      <w:proofErr w:type="spellStart"/>
+      <w:r>
+        <w:rPr>
+          <w:lang w:val="en-US"/>
+        </w:rPr>
+        <w:t>hiç</w:t>
+      </w:r>
+      <w:proofErr w:type="spellEnd"/>
+      <w:r>
+        <w:rPr>
+          <w:lang w:val="en-US"/>
+        </w:rPr>
+        <w:t xml:space="preserve"> var </w:t>
+      </w:r>
+      <w:proofErr w:type="spellStart"/>
+      <w:r>
+        <w:rPr>
+          <w:lang w:val="en-US"/>
+        </w:rPr>
+        <w:t>olmayan</w:t>
+      </w:r>
+      <w:proofErr w:type="spellEnd"/>
+      <w:r>
+        <w:rPr>
+          <w:lang w:val="en-US"/>
+        </w:rPr>
+        <w:t xml:space="preserve"> </w:t>
+      </w:r>
+      <w:proofErr w:type="spellStart"/>
+      <w:r>
+        <w:rPr>
+          <w:lang w:val="en-US"/>
+        </w:rPr>
+        <w:t>bir</w:t>
+      </w:r>
+      <w:proofErr w:type="spellEnd"/>
+      <w:r>
+        <w:rPr>
+          <w:lang w:val="en-US"/>
+        </w:rPr>
+        <w:t xml:space="preserve"> </w:t>
+      </w:r>
+      <w:proofErr w:type="spellStart"/>
+      <w:r>
+        <w:rPr>
+          <w:lang w:val="en-US"/>
+        </w:rPr>
+        <w:t>dizine</w:t>
+      </w:r>
+      <w:proofErr w:type="spellEnd"/>
+      <w:r>
+        <w:rPr>
+          <w:lang w:val="en-US"/>
+        </w:rPr>
+        <w:t xml:space="preserve"> </w:t>
+      </w:r>
+      <w:proofErr w:type="spellStart"/>
+      <w:r>
+        <w:rPr>
+          <w:lang w:val="en-US"/>
+        </w:rPr>
+        <w:t>geri</w:t>
+      </w:r>
+      <w:proofErr w:type="spellEnd"/>
+      <w:r>
+        <w:rPr>
+          <w:lang w:val="en-US"/>
+        </w:rPr>
+        <w:t xml:space="preserve"> </w:t>
+      </w:r>
+      <w:proofErr w:type="spellStart"/>
       <w:r>
         <w:rPr>
           <w:lang w:val="en-US"/>
         </w:rPr>
         <w:lastRenderedPageBreak/>
+        <w:t>yükleme</w:t>
+      </w:r>
+      <w:proofErr w:type="spellEnd"/>
+      <w:r>
+        <w:rPr>
+          <w:lang w:val="en-US"/>
+        </w:rPr>
+        <w:t xml:space="preserve"> </w:t>
+      </w:r>
+      <w:proofErr w:type="spellStart"/>
+      <w:r>
+        <w:rPr>
+          <w:lang w:val="en-US"/>
+        </w:rPr>
+        <w:t>yapılarak</w:t>
+      </w:r>
+      <w:proofErr w:type="spellEnd"/>
+      <w:r>
+        <w:rPr>
+          <w:lang w:val="en-US"/>
+        </w:rPr>
+        <w:t xml:space="preserve"> tam </w:t>
+      </w:r>
+      <w:proofErr w:type="spellStart"/>
+      <w:r>
+        <w:rPr>
+          <w:lang w:val="en-US"/>
+        </w:rPr>
+        <w:t>kontrol</w:t>
+      </w:r>
+      <w:proofErr w:type="spellEnd"/>
+      <w:r>
+        <w:rPr>
+          <w:lang w:val="en-US"/>
+        </w:rPr>
+        <w:t xml:space="preserve"> </w:t>
+      </w:r>
+      <w:proofErr w:type="spellStart"/>
+      <w:r>
+        <w:rPr>
+          <w:lang w:val="en-US"/>
+        </w:rPr>
+        <w:t>gerçekleştirilmiştir</w:t>
+      </w:r>
+      <w:proofErr w:type="spellEnd"/>
+      <w:r>
+        <w:rPr>
+          <w:lang w:val="en-US"/>
+        </w:rPr>
+        <w:t xml:space="preserve">. Bu </w:t>
+      </w:r>
+      <w:proofErr w:type="spellStart"/>
+      <w:r>
+        <w:rPr>
+          <w:lang w:val="en-US"/>
+        </w:rPr>
+        <w:t>k</w:t>
+      </w:r>
+      <w:r>
+        <w:rPr>
+          <w:lang w:val="en-US"/>
+        </w:rPr>
+        <w:t>ontroller</w:t>
+      </w:r>
+      <w:proofErr w:type="spellEnd"/>
+      <w:r>
+        <w:rPr>
+          <w:lang w:val="en-US"/>
+        </w:rPr>
+        <w:t xml:space="preserve"> </w:t>
+      </w:r>
+      <w:proofErr w:type="spellStart"/>
+      <w:r>
+        <w:rPr>
+          <w:lang w:val="en-US"/>
+        </w:rPr>
+        <w:t>sonrasında</w:t>
+      </w:r>
+      <w:proofErr w:type="spellEnd"/>
+      <w:r>
+        <w:rPr>
+          <w:lang w:val="en-US"/>
+        </w:rPr>
+        <w:t xml:space="preserve"> </w:t>
+      </w:r>
+      <w:proofErr w:type="spellStart"/>
+      <w:r>
+        <w:rPr>
+          <w:lang w:val="en-US"/>
+        </w:rPr>
+        <w:t>boş</w:t>
+      </w:r>
+      <w:proofErr w:type="spellEnd"/>
+      <w:r>
+        <w:rPr>
+          <w:lang w:val="en-US"/>
+        </w:rPr>
+        <w:t xml:space="preserve"> </w:t>
+      </w:r>
+      <w:proofErr w:type="spellStart"/>
+      <w:r>
+        <w:rPr>
+          <w:lang w:val="en-US"/>
+        </w:rPr>
+        <w:t>dizine</w:t>
+      </w:r>
+      <w:proofErr w:type="spellEnd"/>
+      <w:r>
+        <w:rPr>
+          <w:lang w:val="en-US"/>
+        </w:rPr>
+        <w:t xml:space="preserve"> </w:t>
+      </w:r>
+      <w:proofErr w:type="spellStart"/>
+      <w:r>
+        <w:rPr>
+          <w:lang w:val="en-US"/>
+        </w:rPr>
+        <w:t>dahi</w:t>
+      </w:r>
+      <w:proofErr w:type="spellEnd"/>
+      <w:r>
+        <w:rPr>
+          <w:lang w:val="en-US"/>
+        </w:rPr>
+        <w:t xml:space="preserve"> </w:t>
+      </w:r>
+      <w:proofErr w:type="spellStart"/>
+      <w:r>
+        <w:rPr>
+          <w:lang w:val="en-US"/>
+        </w:rPr>
+        <w:t>geri</w:t>
+      </w:r>
+      <w:proofErr w:type="spellEnd"/>
+      <w:r>
+        <w:rPr>
+          <w:lang w:val="en-US"/>
+        </w:rPr>
+        <w:t xml:space="preserve"> </w:t>
+      </w:r>
+      <w:proofErr w:type="spellStart"/>
+      <w:r>
+        <w:rPr>
+          <w:lang w:val="en-US"/>
+        </w:rPr>
+        <w:t>yükleme</w:t>
+      </w:r>
+      <w:proofErr w:type="spellEnd"/>
+      <w:r>
+        <w:rPr>
+          <w:lang w:val="en-US"/>
+        </w:rPr>
+        <w:t xml:space="preserve"> </w:t>
+      </w:r>
+      <w:proofErr w:type="spellStart"/>
+      <w:r>
+        <w:rPr>
+          <w:lang w:val="en-US"/>
+        </w:rPr>
+        <w:t>yapılabildiği</w:t>
+      </w:r>
+      <w:proofErr w:type="spellEnd"/>
+      <w:r>
+        <w:rPr>
+          <w:lang w:val="en-US"/>
+        </w:rPr>
+        <w:t xml:space="preserve">, </w:t>
+      </w:r>
+      <w:proofErr w:type="spellStart"/>
+      <w:r>
+        <w:rPr>
+          <w:lang w:val="en-US"/>
+        </w:rPr>
+        <w:t>verilerin</w:t>
+      </w:r>
+      <w:proofErr w:type="spellEnd"/>
+      <w:r>
+        <w:rPr>
+          <w:lang w:val="en-US"/>
+        </w:rPr>
+        <w:t xml:space="preserve"> </w:t>
+      </w:r>
+      <w:proofErr w:type="spellStart"/>
+      <w:r>
+        <w:rPr>
+          <w:lang w:val="en-US"/>
+        </w:rPr>
+        <w:t>düzgün</w:t>
+      </w:r>
+      <w:proofErr w:type="spellEnd"/>
+      <w:r>
+        <w:rPr>
+          <w:lang w:val="en-US"/>
+        </w:rPr>
+        <w:t xml:space="preserve"> </w:t>
+      </w:r>
+      <w:proofErr w:type="spellStart"/>
+      <w:r>
+        <w:rPr>
+          <w:lang w:val="en-US"/>
+        </w:rPr>
+        <w:t>şekilde</w:t>
+      </w:r>
+      <w:proofErr w:type="spellEnd"/>
+      <w:r>
+        <w:rPr>
+          <w:lang w:val="en-US"/>
+        </w:rPr>
+        <w:t xml:space="preserve"> </w:t>
+      </w:r>
+      <w:proofErr w:type="spellStart"/>
+      <w:r>
+        <w:rPr>
+          <w:lang w:val="en-US"/>
+        </w:rPr>
+        <w:t>yedeklendiği</w:t>
+      </w:r>
+      <w:proofErr w:type="spellEnd"/>
+      <w:r>
+        <w:rPr>
+          <w:lang w:val="en-US"/>
+        </w:rPr>
+        <w:t xml:space="preserve"> </w:t>
+      </w:r>
+      <w:proofErr w:type="spellStart"/>
+      <w:r>
+        <w:rPr>
+          <w:lang w:val="en-US"/>
+        </w:rPr>
+        <w:t>ve</w:t>
+      </w:r>
+      <w:proofErr w:type="spellEnd"/>
+      <w:r>
+        <w:rPr>
+          <w:lang w:val="en-US"/>
+        </w:rPr>
+        <w:t xml:space="preserve"> </w:t>
+      </w:r>
+      <w:proofErr w:type="spellStart"/>
+      <w:r>
+        <w:rPr>
+          <w:lang w:val="en-US"/>
+        </w:rPr>
+        <w:t>geri</w:t>
+      </w:r>
+      <w:proofErr w:type="spellEnd"/>
+      <w:r>
+        <w:rPr>
+          <w:lang w:val="en-US"/>
+        </w:rPr>
+        <w:t xml:space="preserve"> </w:t>
+      </w:r>
+      <w:proofErr w:type="spellStart"/>
+      <w:r>
+        <w:rPr>
+          <w:lang w:val="en-US"/>
+        </w:rPr>
+        <w:t>yüklendiği</w:t>
+      </w:r>
+      <w:proofErr w:type="spellEnd"/>
+      <w:r>
+        <w:rPr>
+          <w:lang w:val="en-US"/>
+        </w:rPr>
+        <w:t xml:space="preserve"> </w:t>
+      </w:r>
+      <w:proofErr w:type="spellStart"/>
+      <w:r>
+        <w:rPr>
+          <w:lang w:val="en-US"/>
+        </w:rPr>
+        <w:t>görülmüştür</w:t>
+      </w:r>
+      <w:proofErr w:type="spellEnd"/>
+      <w:r>
+        <w:rPr>
+          <w:lang w:val="en-US"/>
+        </w:rPr>
+        <w:t>.</w:t>
+      </w:r>
+    </w:p>
+    <w:p>
+      <w:pPr>
+        <w:spacing w:before="240"/>
+        <w:rPr>
+          <w:lang w:val="en-US"/>
+        </w:rPr>
+      </w:pPr>
+      <w:r>
+        <w:rPr>
+          <w:lang w:val="en-US"/>
+        </w:rPr>
         <w:drawing>
           <wp:inline distT="0" distB="0" distL="0" distR="0" wp14:anchorId="48554455" wp14:editId="31F69B3A">
             <wp:extent cx="5971540" cy="2945130"/>
@@ -1308,6 +2856,457 @@
           </wp:inline>
         </w:drawing>
       </w:r>
+    </w:p>
+    <w:p>
+      <w:pPr>
+        <w:spacing w:before="240"/>
+        <w:rPr>
+          <w:lang w:val="en-US"/>
+        </w:rPr>
+      </w:pPr>
+    </w:p>
+    <w:p>
+      <w:pPr>
+        <w:pStyle w:val="Titre1"/>
+        <w:rPr>
+          <w:lang w:val="en-US"/>
+        </w:rPr>
+      </w:pPr>
+      <w:proofErr w:type="spellStart"/>
+      <w:r>
+        <w:rPr>
+          <w:lang w:val="en-US"/>
+        </w:rPr>
+        <w:t>Çıktılar</w:t>
+      </w:r>
+      <w:proofErr w:type="spellEnd"/>
+    </w:p>
+    <w:p>
+      <w:pPr>
+        <w:rPr>
+          <w:lang w:val="en-US"/>
+        </w:rPr>
+      </w:pPr>
+    </w:p>
+    <w:p>
+      <w:pPr>
+        <w:rPr>
+          <w:lang w:val="en-US"/>
+        </w:rPr>
+      </w:pPr>
+      <w:proofErr w:type="spellStart"/>
+      <w:r>
+        <w:rPr>
+          <w:lang w:val="en-US"/>
+        </w:rPr>
+        <w:t>Proje</w:t>
+      </w:r>
+      <w:proofErr w:type="spellEnd"/>
+      <w:r>
+        <w:rPr>
+          <w:lang w:val="en-US"/>
+        </w:rPr>
+        <w:t xml:space="preserve"> </w:t>
+      </w:r>
+      <w:proofErr w:type="spellStart"/>
+      <w:r>
+        <w:rPr>
+          <w:lang w:val="en-US"/>
+        </w:rPr>
+        <w:t>kapsamında</w:t>
+      </w:r>
+      <w:proofErr w:type="spellEnd"/>
+      <w:r>
+        <w:rPr>
+          <w:lang w:val="en-US"/>
+        </w:rPr>
+        <w:t xml:space="preserve"> </w:t>
+      </w:r>
+      <w:proofErr w:type="spellStart"/>
+      <w:r>
+        <w:rPr>
+          <w:lang w:val="en-US"/>
+        </w:rPr>
+        <w:t>yapılan</w:t>
+      </w:r>
+      <w:proofErr w:type="spellEnd"/>
+      <w:r>
+        <w:rPr>
+          <w:lang w:val="en-US"/>
+        </w:rPr>
+        <w:t xml:space="preserve"> </w:t>
+      </w:r>
+      <w:proofErr w:type="spellStart"/>
+      <w:r>
+        <w:rPr>
+          <w:lang w:val="en-US"/>
+        </w:rPr>
+        <w:t>işlemler</w:t>
+      </w:r>
+      <w:proofErr w:type="spellEnd"/>
+      <w:r>
+        <w:rPr>
+          <w:lang w:val="en-US"/>
+        </w:rPr>
+        <w:t xml:space="preserve"> </w:t>
+      </w:r>
+      <w:proofErr w:type="spellStart"/>
+      <w:r>
+        <w:rPr>
+          <w:lang w:val="en-US"/>
+        </w:rPr>
+        <w:t>sayesinde</w:t>
+      </w:r>
+      <w:proofErr w:type="spellEnd"/>
+      <w:r>
+        <w:rPr>
+          <w:lang w:val="en-US"/>
+        </w:rPr>
+        <w:t xml:space="preserve"> </w:t>
+      </w:r>
+      <w:proofErr w:type="spellStart"/>
+      <w:r>
+        <w:rPr>
+          <w:lang w:val="en-US"/>
+        </w:rPr>
+        <w:t>veri</w:t>
+      </w:r>
+      <w:proofErr w:type="spellEnd"/>
+      <w:r>
+        <w:rPr>
+          <w:lang w:val="en-US"/>
+        </w:rPr>
+        <w:t xml:space="preserve"> </w:t>
+      </w:r>
+      <w:proofErr w:type="spellStart"/>
+      <w:r>
+        <w:rPr>
+          <w:lang w:val="en-US"/>
+        </w:rPr>
+        <w:t>tabanlarının</w:t>
+      </w:r>
+      <w:proofErr w:type="spellEnd"/>
+      <w:r>
+        <w:rPr>
+          <w:lang w:val="en-US"/>
+        </w:rPr>
+        <w:t xml:space="preserve"> </w:t>
+      </w:r>
+      <w:proofErr w:type="spellStart"/>
+      <w:r>
+        <w:rPr>
+          <w:lang w:val="en-US"/>
+        </w:rPr>
+        <w:t>elle</w:t>
+      </w:r>
+      <w:proofErr w:type="spellEnd"/>
+      <w:r>
+        <w:rPr>
+          <w:lang w:val="en-US"/>
+        </w:rPr>
+        <w:t xml:space="preserve"> </w:t>
+      </w:r>
+      <w:proofErr w:type="spellStart"/>
+      <w:r>
+        <w:rPr>
+          <w:lang w:val="en-US"/>
+        </w:rPr>
+        <w:t>nasıl</w:t>
+      </w:r>
+      <w:proofErr w:type="spellEnd"/>
+      <w:r>
+        <w:rPr>
+          <w:lang w:val="en-US"/>
+        </w:rPr>
+        <w:t xml:space="preserve"> </w:t>
+      </w:r>
+      <w:proofErr w:type="spellStart"/>
+      <w:r>
+        <w:rPr>
+          <w:lang w:val="en-US"/>
+        </w:rPr>
+        <w:t>yedeklenebilceği</w:t>
+      </w:r>
+      <w:proofErr w:type="spellEnd"/>
+      <w:r>
+        <w:rPr>
+          <w:lang w:val="en-US"/>
+        </w:rPr>
+        <w:t xml:space="preserve">, </w:t>
+      </w:r>
+      <w:proofErr w:type="spellStart"/>
+      <w:r>
+        <w:rPr>
+          <w:lang w:val="en-US"/>
+        </w:rPr>
+        <w:t>veri</w:t>
+      </w:r>
+      <w:proofErr w:type="spellEnd"/>
+      <w:r>
+        <w:rPr>
+          <w:lang w:val="en-US"/>
+        </w:rPr>
+        <w:t xml:space="preserve"> </w:t>
+      </w:r>
+      <w:proofErr w:type="spellStart"/>
+      <w:r>
+        <w:rPr>
+          <w:lang w:val="en-US"/>
+        </w:rPr>
+        <w:t>tabanı</w:t>
+      </w:r>
+      <w:proofErr w:type="spellEnd"/>
+      <w:r>
+        <w:rPr>
+          <w:lang w:val="en-US"/>
+        </w:rPr>
+        <w:t xml:space="preserve"> </w:t>
+      </w:r>
+      <w:proofErr w:type="spellStart"/>
+      <w:r>
+        <w:rPr>
+          <w:lang w:val="en-US"/>
+        </w:rPr>
+        <w:t>yedekleme</w:t>
+      </w:r>
+      <w:proofErr w:type="spellEnd"/>
+      <w:r>
+        <w:rPr>
+          <w:lang w:val="en-US"/>
+        </w:rPr>
+        <w:t xml:space="preserve"> </w:t>
+      </w:r>
+      <w:proofErr w:type="spellStart"/>
+      <w:r>
+        <w:rPr>
+          <w:lang w:val="en-US"/>
+        </w:rPr>
+        <w:t>türlerinin</w:t>
+      </w:r>
+      <w:proofErr w:type="spellEnd"/>
+      <w:r>
+        <w:rPr>
+          <w:lang w:val="en-US"/>
+        </w:rPr>
+        <w:t xml:space="preserve"> </w:t>
+      </w:r>
+      <w:proofErr w:type="spellStart"/>
+      <w:r>
+        <w:rPr>
+          <w:lang w:val="en-US"/>
+        </w:rPr>
+        <w:t>neler</w:t>
+      </w:r>
+      <w:proofErr w:type="spellEnd"/>
+      <w:r>
+        <w:rPr>
+          <w:lang w:val="en-US"/>
+        </w:rPr>
+        <w:t xml:space="preserve"> </w:t>
+      </w:r>
+      <w:proofErr w:type="spellStart"/>
+      <w:r>
+        <w:rPr>
+          <w:lang w:val="en-US"/>
+        </w:rPr>
+        <w:t>olduğu</w:t>
+      </w:r>
+      <w:proofErr w:type="spellEnd"/>
+      <w:r>
+        <w:rPr>
+          <w:lang w:val="en-US"/>
+        </w:rPr>
+        <w:t xml:space="preserve">, </w:t>
+      </w:r>
+      <w:proofErr w:type="spellStart"/>
+      <w:r>
+        <w:rPr>
+          <w:lang w:val="en-US"/>
+        </w:rPr>
+        <w:t>veri</w:t>
+      </w:r>
+      <w:proofErr w:type="spellEnd"/>
+      <w:r>
+        <w:rPr>
+          <w:lang w:val="en-US"/>
+        </w:rPr>
+        <w:t xml:space="preserve"> </w:t>
+      </w:r>
+      <w:proofErr w:type="spellStart"/>
+      <w:r>
+        <w:rPr>
+          <w:lang w:val="en-US"/>
+        </w:rPr>
+        <w:t>tabanı</w:t>
+      </w:r>
+      <w:proofErr w:type="spellEnd"/>
+      <w:r>
+        <w:rPr>
+          <w:lang w:val="en-US"/>
+        </w:rPr>
+        <w:t xml:space="preserve"> </w:t>
+      </w:r>
+      <w:proofErr w:type="spellStart"/>
+      <w:r>
+        <w:rPr>
+          <w:lang w:val="en-US"/>
+        </w:rPr>
+        <w:t>yedekleme</w:t>
+      </w:r>
+      <w:proofErr w:type="spellEnd"/>
+      <w:r>
+        <w:rPr>
+          <w:lang w:val="en-US"/>
+        </w:rPr>
+        <w:t xml:space="preserve"> </w:t>
+      </w:r>
+      <w:proofErr w:type="spellStart"/>
+      <w:r>
+        <w:rPr>
+          <w:lang w:val="en-US"/>
+        </w:rPr>
+        <w:t>stratejilerinin</w:t>
+      </w:r>
+      <w:proofErr w:type="spellEnd"/>
+      <w:r>
+        <w:rPr>
+          <w:lang w:val="en-US"/>
+        </w:rPr>
+        <w:t xml:space="preserve"> </w:t>
+      </w:r>
+      <w:proofErr w:type="spellStart"/>
+      <w:r>
+        <w:rPr>
+          <w:lang w:val="en-US"/>
+        </w:rPr>
+        <w:t>nasıl</w:t>
+      </w:r>
+      <w:proofErr w:type="spellEnd"/>
+      <w:r>
+        <w:rPr>
+          <w:lang w:val="en-US"/>
+        </w:rPr>
+        <w:t xml:space="preserve"> </w:t>
+      </w:r>
+      <w:proofErr w:type="spellStart"/>
+      <w:r>
+        <w:rPr>
+          <w:lang w:val="en-US"/>
+        </w:rPr>
+        <w:t>hazırlanması</w:t>
+      </w:r>
+      <w:proofErr w:type="spellEnd"/>
+      <w:r>
+        <w:rPr>
+          <w:lang w:val="en-US"/>
+        </w:rPr>
+        <w:t xml:space="preserve"> </w:t>
+      </w:r>
+      <w:proofErr w:type="spellStart"/>
+      <w:r>
+        <w:rPr>
+          <w:lang w:val="en-US"/>
+        </w:rPr>
+        <w:t>gerektiği</w:t>
+      </w:r>
+      <w:proofErr w:type="spellEnd"/>
+      <w:r>
+        <w:rPr>
+          <w:lang w:val="en-US"/>
+        </w:rPr>
+        <w:t xml:space="preserve">, </w:t>
+      </w:r>
+      <w:proofErr w:type="spellStart"/>
+      <w:r>
+        <w:rPr>
+          <w:lang w:val="en-US"/>
+        </w:rPr>
+        <w:t>hazırlanan</w:t>
+      </w:r>
+      <w:proofErr w:type="spellEnd"/>
+      <w:r>
+        <w:rPr>
+          <w:lang w:val="en-US"/>
+        </w:rPr>
+        <w:t xml:space="preserve"> </w:t>
+      </w:r>
+      <w:proofErr w:type="spellStart"/>
+      <w:r>
+        <w:rPr>
+          <w:lang w:val="en-US"/>
+        </w:rPr>
+        <w:t>stratejilerin</w:t>
+      </w:r>
+      <w:proofErr w:type="spellEnd"/>
+      <w:r>
+        <w:rPr>
+          <w:lang w:val="en-US"/>
+        </w:rPr>
+        <w:t xml:space="preserve"> </w:t>
+      </w:r>
+      <w:proofErr w:type="spellStart"/>
+      <w:r>
+        <w:rPr>
+          <w:lang w:val="en-US"/>
+        </w:rPr>
+        <w:t>nasıl</w:t>
+      </w:r>
+      <w:proofErr w:type="spellEnd"/>
+      <w:r>
+        <w:rPr>
+          <w:lang w:val="en-US"/>
+        </w:rPr>
+        <w:t xml:space="preserve"> </w:t>
+      </w:r>
+      <w:proofErr w:type="spellStart"/>
+      <w:r>
+        <w:rPr>
+          <w:lang w:val="en-US"/>
+        </w:rPr>
+        <w:t>uygulamaya</w:t>
+      </w:r>
+      <w:proofErr w:type="spellEnd"/>
+      <w:r>
+        <w:rPr>
+          <w:lang w:val="en-US"/>
+        </w:rPr>
+        <w:t xml:space="preserve"> </w:t>
+      </w:r>
+      <w:proofErr w:type="spellStart"/>
+      <w:r>
+        <w:rPr>
+          <w:lang w:val="en-US"/>
+        </w:rPr>
+        <w:t>döküleceği</w:t>
+      </w:r>
+      <w:proofErr w:type="spellEnd"/>
+      <w:r>
+        <w:rPr>
+          <w:lang w:val="en-US"/>
+        </w:rPr>
+        <w:t xml:space="preserve"> </w:t>
+      </w:r>
+      <w:proofErr w:type="spellStart"/>
+      <w:r>
+        <w:rPr>
+          <w:lang w:val="en-US"/>
+        </w:rPr>
+        <w:t>öğrenilmiştir</w:t>
+      </w:r>
+      <w:proofErr w:type="spellEnd"/>
+      <w:r>
+        <w:rPr>
+          <w:lang w:val="en-US"/>
+        </w:rPr>
+        <w:t xml:space="preserve">.  </w:t>
+      </w:r>
+    </w:p>
+    <w:p>
+      <w:pPr>
+        <w:rPr>
+          <w:lang w:val="en-US"/>
+        </w:rPr>
+      </w:pPr>
     </w:p>
     <w:sectPr>
       <w:pgSz w:w="12240" w:h="15840"/>

</xml_diff>